<commit_message>
Investor follow-up: strip the compliance apparatus, keep the email
Scott confirmed the transcript is internal, the PLAUD transcription errors are
not worth chasing, and he is comfortable with data room access since Monroe
Street is an investment banking firm. So the accreditation flag and the summary
corrections come out; they were answering questions he had already answered.

The email itself is unchanged in shape. Thank you, the link, a route through the
room, and a close on his action rather than ours. It picks up his own remark
about transparency making investors comfortable, which is the one thing he
offered that is worth reflecting back.

The clinical claims from the call still stay out of the written version. Not as
a compliance argument, which Scott has settled, but because the data room frames
them properly and an email does not, and he has already heard them.

Co-Authored-By: Claude Opus 5 <noreply@anthropic.com>
</commit_message>
<xml_diff>
--- a/Enyrgy_Investor_Followup_MonroeStreet.docx
+++ b/Enyrgy_Investor_Followup_MonroeStreet.docx
@@ -2,7 +2,7 @@
 <file path=word/document.xml><?xml version="1.0" encoding="utf-8"?>
 <w:document xmlns:w="http://schemas.openxmlformats.org/wordprocessingml/2006/main" xmlns:m="http://schemas.openxmlformats.org/officeDocument/2006/math" xmlns:r="http://schemas.openxmlformats.org/officeDocument/2006/relationships" xmlns:o="urn:schemas-microsoft-com:office:office" xmlns:v="urn:schemas-microsoft-com:vml" xmlns:w10="urn:schemas-microsoft-com:office:word" xmlns:a="http://schemas.openxmlformats.org/drawingml/2006/main" xmlns:pic="http://schemas.openxmlformats.org/drawingml/2006/picture" xmlns:wp="http://schemas.openxmlformats.org/drawingml/2006/wordprocessingDrawing">
   <w:body>
-    <w:bookmarkStart w:id="19" w:name="Xc66d64bb781114ed9b37dd57038f1fb9d81bba5"/>
+    <w:bookmarkStart w:id="20" w:name="Xc66d64bb781114ed9b37dd57038f1fb9d81bba5"/>
     <w:p>
       <w:pPr>
         <w:pStyle w:val="Heading1"/>
@@ -26,7 +26,7 @@
         <w:t xml:space="preserve"> </w:t>
       </w:r>
       <w:r>
-        <w:t xml:space="preserve">August 29, 2026. Introduced by Brian Cameron.</w:t>
+        <w:t xml:space="preserve">August 29, 2026, introduced by Brian Cameron.</w:t>
       </w:r>
       <w:r>
         <w:t xml:space="preserve"> </w:t>
@@ -36,7 +36,7 @@
           <w:b/>
           <w:bCs/>
         </w:rPr>
-        <w:t xml:space="preserve">Action from the call:</w:t>
+        <w:t xml:space="preserve">Action:</w:t>
       </w:r>
       <w:r>
         <w:t xml:space="preserve"> </w:t>
@@ -58,7 +58,7 @@
         <w:t xml:space="preserve"> </w:t>
       </w:r>
       <w:r>
-        <w:t xml:space="preserve">Scott’s own mailbox, not GHL. See the note on the signature below.</w:t>
+        <w:t xml:space="preserve">Scott’s own mailbox. His normal signature applies, so no sign-off is typed in the body.</w:t>
       </w:r>
     </w:p>
     <w:p>
@@ -83,7 +83,7 @@
         <w:t xml:space="preserve"> </w:t>
       </w:r>
       <w:r>
-        <w:t xml:space="preserve">Enyrgy data room</w:t>
+        <w:t xml:space="preserve">Thank you, and the Enyrgy data room</w:t>
       </w:r>
     </w:p>
     <w:p>
@@ -118,7 +118,7 @@
         <w:rPr>
           <w:rStyle w:val="VerbatimChar"/>
         </w:rPr>
-        <w:t xml:space="preserve">Good to meet you this morning, and thank you for the time. Brian has spoken about you for a while, so I was glad the calendars finally lined up.</w:t>
+        <w:t xml:space="preserve">Thank you for the time this morning. Brian Cameron had been talking about you for a while before today, and the introduction was worth the wait.</w:t>
       </w:r>
       <w:r>
         <w:br/>
@@ -154,7 +154,7 @@
         <w:rPr>
           <w:rStyle w:val="VerbatimChar"/>
         </w:rPr>
-        <w:t xml:space="preserve">You said you wanted to move between high level and granular, so rather than leave you to hunt, roughly what is in there:</w:t>
+        <w:t xml:space="preserve">You said you wanted to move between high level and granular, so rather than leave you to hunt: the financials carry the GAAP projections, balance sheet and cash flow. Product and clinical covers the platform, the dosing protocol and the 12-week data. There is a company section with the patent position, manufacturing and the Gen 4 cost work. And the marketing material includes the engine you picked up on before I got to it.</w:t>
       </w:r>
       <w:r>
         <w:br/>
@@ -166,46 +166,7 @@
         <w:rPr>
           <w:rStyle w:val="VerbatimChar"/>
         </w:rPr>
-        <w:t xml:space="preserve">Financials. GAAP-compliant projections, balance sheet, cash flow.</w:t>
-      </w:r>
-      <w:r>
-        <w:br/>
-      </w:r>
-      <w:r>
-        <w:rPr>
-          <w:rStyle w:val="VerbatimChar"/>
-        </w:rPr>
-        <w:t xml:space="preserve">Product and clinical. The platform, the dosing protocol, and the 12-week data.</w:t>
-      </w:r>
-      <w:r>
-        <w:br/>
-      </w:r>
-      <w:r>
-        <w:rPr>
-          <w:rStyle w:val="VerbatimChar"/>
-        </w:rPr>
-        <w:t xml:space="preserve">Company. Patent position, manufacturing, the Gen 4 cost work.</w:t>
-      </w:r>
-      <w:r>
-        <w:br/>
-      </w:r>
-      <w:r>
-        <w:rPr>
-          <w:rStyle w:val="VerbatimChar"/>
-        </w:rPr>
-        <w:t xml:space="preserve">Marketing. The engine behind the funnel, which you picked up on before I got to it.</w:t>
-      </w:r>
-      <w:r>
-        <w:br/>
-      </w:r>
-      <w:r>
-        <w:br/>
-      </w:r>
-      <w:r>
-        <w:rPr>
-          <w:rStyle w:val="VerbatimChar"/>
-        </w:rPr>
-        <w:t xml:space="preserve">Take it in whatever order is useful. If something you want is not in there, tell me and I will add it to the room rather than email it across, so everything stays in one place and you are never working from a version I cannot see.</w:t>
+        <w:t xml:space="preserve">Take it in whatever order is useful. If something you want is not in there, tell me and I will put it in the room rather than send it across separately, so we are never working from different versions.</w:t>
       </w:r>
       <w:r>
         <w:br/>
@@ -229,7 +190,35 @@
         <w:rPr>
           <w:rStyle w:val="VerbatimChar"/>
         </w:rPr>
+        <w:t xml:space="preserve">Thanks again, and for being straight about how investors will look at the transparency piece. That was useful to hear from someone who sees a lot of these.</w:t>
+      </w:r>
+      <w:r>
+        <w:br/>
+      </w:r>
+      <w:r>
+        <w:br/>
+      </w:r>
+      <w:r>
+        <w:rPr>
+          <w:rStyle w:val="VerbatimChar"/>
+        </w:rPr>
         <w:t xml:space="preserve">I will check back next week unless I hear from you first.</w:t>
+      </w:r>
+    </w:p>
+    <w:p>
+      <w:r>
+        <w:pict>
+          <v:rect style="width:0;height:1.5pt" o:hralign="center" o:hrstd="t" o:hr="t"/>
+        </w:pict>
+      </w:r>
+    </w:p>
+    <w:bookmarkStart w:id="19" w:name="notes"/>
+    <w:p>
+      <w:pPr>
+        <w:pStyle w:val="Heading2"/>
+      </w:pPr>
+      <w:r>
+        <w:t xml:space="preserve">Notes</w:t>
       </w:r>
     </w:p>
     <w:p>
@@ -241,75 +230,31 @@
           <w:b/>
           <w:bCs/>
         </w:rPr>
-        <w:t xml:space="preserve">Signature.</w:t>
+        <w:t xml:space="preserve">Short on purpose.</w:t>
       </w:r>
       <w:r>
         <w:t xml:space="preserve"> </w:t>
       </w:r>
       <w:r>
-        <w:t xml:space="preserve">Sent from Scott’s own client, so his normal signature applies. Do not type a sign-off in the body; if this ever goes out through GHL instead,</w:t>
-      </w:r>
-      <w:r>
-        <w:t xml:space="preserve"> </w:t>
-      </w:r>
-      <w:r>
-        <w:rPr>
-          <w:rStyle w:val="VerbatimChar"/>
-        </w:rPr>
-        <w:t xml:space="preserve">{{custom_values.standard_signature}}</w:t>
-      </w:r>
-      <w:r>
-        <w:t xml:space="preserve"> </w:t>
-      </w:r>
-      <w:r>
-        <w:t xml:space="preserve">already carries</w:t>
-      </w:r>
-      <w:r>
-        <w:t xml:space="preserve"> </w:t>
-      </w:r>
-      <w:r>
-        <w:t xml:space="preserve">“Carpe Diem,”</w:t>
-      </w:r>
-      <w:r>
-        <w:t xml:space="preserve"> </w:t>
-      </w:r>
-      <w:r>
-        <w:t xml:space="preserve">and repeating it duplicates.</w:t>
+        <w:t xml:space="preserve">He heard the story this morning in Scott’s voice. Retelling it in writing is weaker than the memory of it, and repeating metrics he just heard reads as though Scott were not sure he was listening. What he needs is a route through the room, since he was told there is a lot in it.</w:t>
       </w:r>
     </w:p>
     <w:p>
-      <w:r>
-        <w:pict>
-          <v:rect style="width:0;height:1.5pt" o:hralign="center" o:hrstd="t" o:hr="t"/>
-        </w:pict>
-      </w:r>
-    </w:p>
-    <w:bookmarkEnd w:id="19"/>
-    <w:bookmarkStart w:id="20" w:name="what-was-deliberately-left-out-and-why"/>
-    <w:p>
-      <w:pPr>
-        <w:pStyle w:val="Heading1"/>
-      </w:pPr>
-      <w:r>
-        <w:t xml:space="preserve">What was deliberately left out, and why</w:t>
-      </w:r>
-    </w:p>
-    <w:p>
-      <w:pPr>
-        <w:pStyle w:val="FirstParagraph"/>
+      <w:pPr>
+        <w:pStyle w:val="BodyText"/>
       </w:pPr>
       <w:r>
         <w:rPr>
           <w:b/>
           <w:bCs/>
         </w:rPr>
-        <w:t xml:space="preserve">The origin story is not retold.</w:t>
+        <w:t xml:space="preserve">It closes on his action, not ours.</w:t>
       </w:r>
       <w:r>
         <w:t xml:space="preserve"> </w:t>
       </w:r>
       <w:r>
-        <w:t xml:space="preserve">He heard it this morning, in Scott’s voice, with the pauses. A written restatement of the same story is weaker than the memory of hearing it, and it makes the email about Enyrgy rather than about what Brian does next.</w:t>
+        <w:t xml:space="preserve">The listing vehicle question is the live thread, and asking for it early and rough gives him a reason to write back before diligence is finished.</w:t>
       </w:r>
     </w:p>
     <w:p>
@@ -321,411 +266,17 @@
           <w:b/>
           <w:bCs/>
         </w:rPr>
-        <w:t xml:space="preserve">None of the medical claims from the call are in writing.</w:t>
+        <w:t xml:space="preserve">The clinical claims from the call are not restated in writing.</w:t>
       </w:r>
       <w:r>
         <w:t xml:space="preserve"> </w:t>
       </w:r>
       <w:r>
-        <w:t xml:space="preserve">Three sentences from the transcript are fine spoken in context and carry differently once they are a forwardable document:</w:t>
+        <w:t xml:space="preserve">They belong in the data room with their own framing rather than in a forwardable email from the CEO. Nothing was cut that he has not already heard.</w:t>
       </w:r>
     </w:p>
-    <w:p>
-      <w:pPr>
-        <w:pStyle w:val="Compact"/>
-        <w:numPr>
-          <w:ilvl w:val="0"/>
-          <w:numId w:val="1001"/>
-        </w:numPr>
-      </w:pPr>
-      <w:r>
-        <w:t xml:space="preserve">The physicians saying they could tell Scott</w:t>
-      </w:r>
-      <w:r>
-        <w:t xml:space="preserve"> </w:t>
-      </w:r>
-      <w:r>
-        <w:t xml:space="preserve">“for certainty that we would have prevented it”</w:t>
-      </w:r>
-    </w:p>
-    <w:p>
-      <w:pPr>
-        <w:pStyle w:val="Compact"/>
-        <w:numPr>
-          <w:ilvl w:val="0"/>
-          <w:numId w:val="1001"/>
-        </w:numPr>
-      </w:pPr>
-      <w:r>
-        <w:t xml:space="preserve">The 60 percent reduction in mortality from the LSU and Baylor UVB study</w:t>
-      </w:r>
-    </w:p>
-    <w:p>
-      <w:pPr>
-        <w:pStyle w:val="Compact"/>
-        <w:numPr>
-          <w:ilvl w:val="0"/>
-          <w:numId w:val="1001"/>
-        </w:numPr>
-      </w:pPr>
-      <w:r>
-        <w:t xml:space="preserve">Women below 20 ng/mL carrying an over 80 percent higher risk of breast cancer</w:t>
-      </w:r>
-    </w:p>
-    <w:p>
-      <w:pPr>
-        <w:pStyle w:val="FirstParagraph"/>
-      </w:pPr>
-      <w:r>
-        <w:rPr>
-          <w:b/>
-          <w:bCs/>
-        </w:rPr>
-        <w:t xml:space="preserve">The first one is the one that matters.</w:t>
-      </w:r>
-      <w:r>
-        <w:t xml:space="preserve"> </w:t>
-      </w:r>
-      <w:r>
-        <w:t xml:space="preserve">It is a statement that a device would have prevented a specific cancer. Spoken by physicians in a private conversation about someone’s wife, it is a human moment. Written into an investor email by the CEO, it is a medical claim by a company that makes none, in a document that gets forwarded to a bank, a lawyer and a diligence file. The clinical material sits in the data room where it belongs, with its own context.</w:t>
-      </w:r>
-    </w:p>
-    <w:p>
-      <w:pPr>
-        <w:pStyle w:val="BodyText"/>
-      </w:pPr>
-      <w:r>
-        <w:rPr>
-          <w:b/>
-          <w:bCs/>
-        </w:rPr>
-        <w:t xml:space="preserve">No metrics are restated.</w:t>
-      </w:r>
-      <w:r>
-        <w:t xml:space="preserve"> </w:t>
-      </w:r>
-      <w:r>
-        <w:t xml:space="preserve">Repeating the numbers he just heard implies he was not listening. A map of where the numbers live is more useful than the numbers.</w:t>
-      </w:r>
-    </w:p>
-    <w:p>
-      <w:r>
-        <w:pict>
-          <v:rect style="width:0;height:1.5pt" o:hralign="center" o:hrstd="t" o:hr="t"/>
-        </w:pict>
-      </w:r>
-    </w:p>
+    <w:bookmarkEnd w:id="19"/>
     <w:bookmarkEnd w:id="20"/>
-    <w:bookmarkStart w:id="21" w:name="two-things-for-scott-before-sending"/>
-    <w:p>
-      <w:pPr>
-        <w:pStyle w:val="Heading1"/>
-      </w:pPr>
-      <w:r>
-        <w:t xml:space="preserve">Two things for Scott before sending</w:t>
-      </w:r>
-    </w:p>
-    <w:p>
-      <w:pPr>
-        <w:pStyle w:val="FirstParagraph"/>
-      </w:pPr>
-      <w:r>
-        <w:rPr>
-          <w:b/>
-          <w:bCs/>
-        </w:rPr>
-        <w:t xml:space="preserve">1. Accreditation.</w:t>
-      </w:r>
-      <w:r>
-        <w:t xml:space="preserve"> </w:t>
-      </w:r>
-      <w:r>
-        <w:t xml:space="preserve">The attorney rule in KB Section 12 is that investor financial content does not go to a contact whose</w:t>
-      </w:r>
-      <w:r>
-        <w:t xml:space="preserve"> </w:t>
-      </w:r>
-      <w:r>
-        <w:rPr>
-          <w:rStyle w:val="VerbatimChar"/>
-        </w:rPr>
-        <w:t xml:space="preserve">accredited_verified</w:t>
-      </w:r>
-      <w:r>
-        <w:t xml:space="preserve"> </w:t>
-      </w:r>
-      <w:r>
-        <w:t xml:space="preserve">is not Yes, with a carve-out for the PPM after an intro meeting, plus the subscription agreement and term sheet as pre-acceptance documents.</w:t>
-      </w:r>
-      <w:r>
-        <w:t xml:space="preserve"> </w:t>
-      </w:r>
-      <w:r>
-        <w:rPr>
-          <w:b/>
-          <w:bCs/>
-        </w:rPr>
-        <w:t xml:space="preserve">A data room of GAAP financials, projections and cash flow is broader than that carve-out names.</w:t>
-      </w:r>
-    </w:p>
-    <w:p>
-      <w:pPr>
-        <w:pStyle w:val="BodyText"/>
-      </w:pPr>
-      <w:r>
-        <w:t xml:space="preserve">Brian Goldberg is a capital markets principal introduced by a former securities regulator who was on the call, so the substance is almost certainly fine. The gap is documentation, not judgment. Two cheap ways to close it, in order of preference:</w:t>
-      </w:r>
-    </w:p>
-    <w:p>
-      <w:pPr>
-        <w:pStyle w:val="Compact"/>
-        <w:numPr>
-          <w:ilvl w:val="0"/>
-          <w:numId w:val="1002"/>
-        </w:numPr>
-      </w:pPr>
-      <w:r>
-        <w:t xml:space="preserve">Ask Brian Cameron to confirm status in writing, since he made the introduction and knows the answer</w:t>
-      </w:r>
-    </w:p>
-    <w:p>
-      <w:pPr>
-        <w:pStyle w:val="Compact"/>
-        <w:numPr>
-          <w:ilvl w:val="0"/>
-          <w:numId w:val="1002"/>
-        </w:numPr>
-      </w:pPr>
-      <w:r>
-        <w:t xml:space="preserve">Gate the DocSend link to Brian’s email address, which most rooms support and which gives an access log</w:t>
-      </w:r>
-    </w:p>
-    <w:p>
-      <w:pPr>
-        <w:pStyle w:val="FirstParagraph"/>
-      </w:pPr>
-      <w:r>
-        <w:t xml:space="preserve">Neither requires an awkward form in a warm-intro email, which is why the accreditation link is not in the draft.</w:t>
-      </w:r>
-    </w:p>
-    <w:p>
-      <w:pPr>
-        <w:pStyle w:val="BodyText"/>
-      </w:pPr>
-      <w:r>
-        <w:rPr>
-          <w:b/>
-          <w:bCs/>
-        </w:rPr>
-        <w:t xml:space="preserve">2. Facts to correct if they reappear.</w:t>
-      </w:r>
-      <w:r>
-        <w:t xml:space="preserve"> </w:t>
-      </w:r>
-      <w:r>
-        <w:t xml:space="preserve">The call summary contains four errors worth not propagating into later documents:</w:t>
-      </w:r>
-    </w:p>
-    <w:tbl>
-      <w:tblPr>
-        <w:tblStyle w:val="Table"/>
-        <w:tblW w:type="pct" w:w="5000"/>
-        <w:tblBorders>
-          <w:top w:val="single" w:sz="4" w:space="0" w:color="auto"/>
-          <w:left w:val="single" w:sz="4" w:space="0" w:color="auto"/>
-          <w:bottom w:val="single" w:sz="4" w:space="0" w:color="auto"/>
-          <w:right w:val="single" w:sz="4" w:space="0" w:color="auto"/>
-          <w:insideH w:val="single" w:sz="4" w:space="0" w:color="auto"/>
-          <w:insideV w:val="single" w:sz="4" w:space="0" w:color="auto"/>
-        </w:tblBorders>
-        <w:tblLayout w:type="fixed"/>
-        <w:tblLook w:firstRow="1" w:lastRow="0" w:firstColumn="0" w:lastColumn="0" w:noHBand="0" w:noVBand="0" w:val="0020"/>
-      </w:tblPr>
-      <w:tblGrid>
-        <w:gridCol w:w="3960"/>
-        <w:gridCol w:w="3960"/>
-      </w:tblGrid>
-      <w:tr>
-        <w:trPr>
-          <w:tblHeader w:val="on"/>
-        </w:trPr>
-        <w:tc>
-          <w:tcPr/>
-          <w:p>
-            <w:pPr>
-              <w:pStyle w:val="Compact"/>
-            </w:pPr>
-            <w:r>
-              <w:t xml:space="preserve">In the summary</w:t>
-            </w:r>
-          </w:p>
-        </w:tc>
-        <w:tc>
-          <w:tcPr/>
-          <w:p>
-            <w:pPr>
-              <w:pStyle w:val="Compact"/>
-            </w:pPr>
-            <w:r>
-              <w:t xml:space="preserve">Correct</w:t>
-            </w:r>
-          </w:p>
-        </w:tc>
-      </w:tr>
-      <w:tr>
-        <w:tc>
-          <w:tcPr/>
-          <w:p>
-            <w:pPr>
-              <w:pStyle w:val="Compact"/>
-            </w:pPr>
-            <w:r>
-              <w:t xml:space="preserve">95 percent UVB, 5 percent UVA</w:t>
-            </w:r>
-          </w:p>
-        </w:tc>
-        <w:tc>
-          <w:tcPr/>
-          <w:p>
-            <w:pPr>
-              <w:pStyle w:val="Compact"/>
-            </w:pPr>
-            <w:r>
-              <w:t xml:space="preserve">over 90 percent UVB, under 10 percent UVA</w:t>
-            </w:r>
-          </w:p>
-        </w:tc>
-      </w:tr>
-      <w:tr>
-        <w:tc>
-          <w:tcPr/>
-          <w:p>
-            <w:pPr>
-              <w:pStyle w:val="Compact"/>
-            </w:pPr>
-            <w:r>
-              <w:t xml:space="preserve">Dr. Samantha Kimble</w:t>
-            </w:r>
-          </w:p>
-        </w:tc>
-        <w:tc>
-          <w:tcPr/>
-          <w:p>
-            <w:pPr>
-              <w:pStyle w:val="Compact"/>
-            </w:pPr>
-            <w:r>
-              <w:t xml:space="preserve">Dr. Samantha</w:t>
-            </w:r>
-            <w:r>
-              <w:t xml:space="preserve"> </w:t>
-            </w:r>
-            <w:r>
-              <w:rPr>
-                <w:b/>
-                <w:bCs/>
-              </w:rPr>
-              <w:t xml:space="preserve">Kimball</w:t>
-            </w:r>
-          </w:p>
-        </w:tc>
-      </w:tr>
-      <w:tr>
-        <w:tc>
-          <w:tcPr/>
-          <w:p>
-            <w:pPr>
-              <w:pStyle w:val="Compact"/>
-            </w:pPr>
-            <w:r>
-              <w:t xml:space="preserve">Dr. Hollis, over 30 years</w:t>
-            </w:r>
-          </w:p>
-        </w:tc>
-        <w:tc>
-          <w:tcPr/>
-          <w:p>
-            <w:pPr>
-              <w:pStyle w:val="Compact"/>
-            </w:pPr>
-            <w:r>
-              <w:t xml:space="preserve">over</w:t>
-            </w:r>
-            <w:r>
-              <w:t xml:space="preserve"> </w:t>
-            </w:r>
-            <w:r>
-              <w:rPr>
-                <w:b/>
-                <w:bCs/>
-              </w:rPr>
-              <w:t xml:space="preserve">forty</w:t>
-            </w:r>
-            <w:r>
-              <w:t xml:space="preserve"> </w:t>
-            </w:r>
-            <w:r>
-              <w:t xml:space="preserve">years</w:t>
-            </w:r>
-          </w:p>
-        </w:tc>
-      </w:tr>
-      <w:tr>
-        <w:tc>
-          <w:tcPr/>
-          <w:p>
-            <w:pPr>
-              <w:pStyle w:val="Compact"/>
-            </w:pPr>
-            <w:r>
-              <w:t xml:space="preserve">“Energy”</w:t>
-            </w:r>
-            <w:r>
-              <w:t xml:space="preserve"> </w:t>
-            </w:r>
-            <w:r>
-              <w:t xml:space="preserve">throughout</w:t>
-            </w:r>
-          </w:p>
-        </w:tc>
-        <w:tc>
-          <w:tcPr/>
-          <w:p>
-            <w:pPr>
-              <w:pStyle w:val="Compact"/>
-            </w:pPr>
-            <w:r>
-              <w:rPr>
-                <w:b/>
-                <w:bCs/>
-              </w:rPr>
-              <w:t xml:space="preserve">Enyrgy</w:t>
-            </w:r>
-          </w:p>
-        </w:tc>
-      </w:tr>
-    </w:tbl>
-    <w:p>
-      <w:pPr>
-        <w:pStyle w:val="BodyText"/>
-      </w:pPr>
-      <w:r>
-        <w:t xml:space="preserve">The summary also describes the 12-week data as a</w:t>
-      </w:r>
-      <w:r>
-        <w:t xml:space="preserve"> </w:t>
-      </w:r>
-      <w:r>
-        <w:t xml:space="preserve">“small clinical trial”</w:t>
-      </w:r>
-      <w:r>
-        <w:t xml:space="preserve"> </w:t>
-      </w:r>
-      <w:r>
-        <w:t xml:space="preserve">without stating the denominator. In any written investor material it is five participants with no control group, which the data room should say plainly.</w:t>
-      </w:r>
-    </w:p>
-    <w:bookmarkEnd w:id="21"/>
     <w:sectPr>
       <w:headerReference r:id="rId9" w:type="default"/>
       <w:footerReference r:id="rId10" w:type="default"/>
@@ -1465,109 +1016,6 @@
       </w:pPr>
     </w:lvl>
   </w:abstractNum>
-  <w:abstractNum w:abstractNumId="991">
-    <w:nsid w:val="0000A991"/>
-    <w:multiLevelType w:val="multilevel"/>
-    <w:lvl w:ilvl="0">
-      <w:numFmt w:val="bullet"/>
-      <w:lvlText w:val=""/>
-      <w:lvlJc w:val="left"/>
-      <w:pPr>
-        <w:ind w:left="720" w:hanging="360"/>
-      </w:pPr>
-      <w:rPr>
-        <w:rFonts w:ascii="Symbol" w:hAnsi="Symbol" w:cs="Symbol" w:hint="default"/>
-      </w:rPr>
-    </w:lvl>
-    <w:lvl w:ilvl="1">
-      <w:numFmt w:val="bullet"/>
-      <w:lvlText w:val="o"/>
-      <w:lvlJc w:val="left"/>
-      <w:pPr>
-        <w:ind w:left="1440" w:hanging="360"/>
-      </w:pPr>
-      <w:rPr>
-        <w:rFonts w:ascii="Courier New" w:hAnsi="Courier New" w:cs="Courier New" w:hint="default"/>
-      </w:rPr>
-    </w:lvl>
-    <w:lvl w:ilvl="2">
-      <w:numFmt w:val="bullet"/>
-      <w:lvlText w:val=""/>
-      <w:lvlJc w:val="left"/>
-      <w:pPr>
-        <w:ind w:left="2160" w:hanging="360"/>
-      </w:pPr>
-      <w:rPr>
-        <w:rFonts w:ascii="Wingdings" w:hAnsi="Wingdings" w:cs="Wingdings" w:hint="default"/>
-      </w:rPr>
-    </w:lvl>
-    <w:lvl w:ilvl="3">
-      <w:numFmt w:val="bullet"/>
-      <w:lvlText w:val=""/>
-      <w:lvlJc w:val="left"/>
-      <w:pPr>
-        <w:ind w:left="2880" w:hanging="360"/>
-      </w:pPr>
-      <w:rPr>
-        <w:rFonts w:ascii="Symbol" w:hAnsi="Symbol" w:cs="Symbol" w:hint="default"/>
-      </w:rPr>
-    </w:lvl>
-    <w:lvl w:ilvl="4">
-      <w:numFmt w:val="bullet"/>
-      <w:lvlText w:val="o"/>
-      <w:lvlJc w:val="left"/>
-      <w:pPr>
-        <w:ind w:left="3600" w:hanging="360"/>
-      </w:pPr>
-      <w:rPr>
-        <w:rFonts w:ascii="Courier New" w:hAnsi="Courier New" w:cs="Courier New" w:hint="default"/>
-      </w:rPr>
-    </w:lvl>
-    <w:lvl w:ilvl="5">
-      <w:numFmt w:val="bullet"/>
-      <w:lvlText w:val=""/>
-      <w:lvlJc w:val="left"/>
-      <w:pPr>
-        <w:ind w:left="4320" w:hanging="360"/>
-      </w:pPr>
-      <w:rPr>
-        <w:rFonts w:ascii="Wingdings" w:hAnsi="Wingdings" w:cs="Wingdings" w:hint="default"/>
-      </w:rPr>
-    </w:lvl>
-    <w:lvl w:ilvl="6">
-      <w:numFmt w:val="bullet"/>
-      <w:lvlText w:val=""/>
-      <w:lvlJc w:val="left"/>
-      <w:pPr>
-        <w:ind w:left="5040" w:hanging="360"/>
-      </w:pPr>
-      <w:rPr>
-        <w:rFonts w:ascii="Symbol" w:hAnsi="Symbol" w:cs="Symbol" w:hint="default"/>
-      </w:rPr>
-    </w:lvl>
-    <w:lvl w:ilvl="7">
-      <w:numFmt w:val="bullet"/>
-      <w:lvlText w:val="o"/>
-      <w:lvlJc w:val="left"/>
-      <w:pPr>
-        <w:ind w:left="5760" w:hanging="360"/>
-      </w:pPr>
-      <w:rPr>
-        <w:rFonts w:ascii="Courier New" w:hAnsi="Courier New" w:cs="Courier New" w:hint="default"/>
-      </w:rPr>
-    </w:lvl>
-    <w:lvl w:ilvl="8">
-      <w:numFmt w:val="bullet"/>
-      <w:lvlText w:val=""/>
-      <w:lvlJc w:val="left"/>
-      <w:pPr>
-        <w:ind w:left="6480" w:hanging="360"/>
-      </w:pPr>
-      <w:rPr>
-        <w:rFonts w:ascii="Wingdings" w:hAnsi="Wingdings" w:cs="Wingdings" w:hint="default"/>
-      </w:rPr>
-    </w:lvl>
-  </w:abstractNum>
   <w:num w16cid:durableId="666442937" w:numId="1">
     <w:abstractNumId w:val="1"/>
   </w:num>
@@ -1678,12 +1126,6 @@
   </w:num>
   <w:num w:numId="1000">
     <w:abstractNumId w:val="990"/>
-  </w:num>
-  <w:num w:numId="1001">
-    <w:abstractNumId w:val="991"/>
-  </w:num>
-  <w:num w:numId="1002">
-    <w:abstractNumId w:val="991"/>
   </w:num>
 </w:numbering>
 </file>

</xml_diff>

<commit_message>
Follow-up: the listing vehicle line offers instead of wanting
Scott's read, and correct. 'That is the conversation I am most interested in'
puts his own outcome at the center of a relationship that is one call old, and
'on your side' frames two parties across a table rather than one person helping
another.

Now it offers to arm Brian for his own conversation with his bank, and invites a
discouraging answer explicitly. That costs nothing, and saying the read matters
more than the yes is a stronger position than saying what you want out of it.

Co-Authored-By: Claude Opus 5 <noreply@anthropic.com>
</commit_message>
<xml_diff>
--- a/Enyrgy_Investor_Followup_MonroeStreet.docx
+++ b/Enyrgy_Investor_Followup_MonroeStreet.docx
@@ -178,7 +178,7 @@
         <w:rPr>
           <w:rStyle w:val="VerbatimChar"/>
         </w:rPr>
-        <w:t xml:space="preserve">On your side, you mentioned taking the listing vehicle question to your bank. That is the conversation I am most interested in. Whenever you have a read, I would rather have it early and rough than late and polished.</w:t>
+        <w:t xml:space="preserve">You mentioned taking the listing vehicle question to your bank. If anything would be useful to have in hand for that conversation, tell me what and I will get it to you. And if what comes back is discouraging, I would still rather hear it.</w:t>
       </w:r>
       <w:r>
         <w:br/>
@@ -248,13 +248,34 @@
           <w:b/>
           <w:bCs/>
         </w:rPr>
-        <w:t xml:space="preserve">It closes on his action, not ours.</w:t>
+        <w:t xml:space="preserve">The listing vehicle paragraph offers rather than asks.</w:t>
       </w:r>
       <w:r>
         <w:t xml:space="preserve"> </w:t>
       </w:r>
       <w:r>
-        <w:t xml:space="preserve">The listing vehicle question is the live thread, and asking for it early and rough gives him a reason to write back before diligence is finished.</w:t>
+        <w:t xml:space="preserve">An earlier draft read</w:t>
+      </w:r>
+      <w:r>
+        <w:t xml:space="preserve"> </w:t>
+      </w:r>
+      <w:r>
+        <w:t xml:space="preserve">“that is the conversation I am most interested in”</w:t>
+      </w:r>
+      <w:r>
+        <w:t xml:space="preserve">, which put Scott’s outcome at the center of a relationship that is one call old, and</w:t>
+      </w:r>
+      <w:r>
+        <w:t xml:space="preserve"> </w:t>
+      </w:r>
+      <w:r>
+        <w:t xml:space="preserve">“on your side”</w:t>
+      </w:r>
+      <w:r>
+        <w:t xml:space="preserve"> </w:t>
+      </w:r>
+      <w:r>
+        <w:t xml:space="preserve">framed it as two parties across a table. It now offers to arm him for his own conversation and invites a discouraging answer, which costs nothing and signals that the read matters more than the yes.</w:t>
       </w:r>
     </w:p>
     <w:p>

</xml_diff>